<commit_message>
feat(plantilla-amparo): agrega opciones de companias telefonicas como autoridades responsables opcionales\n\n- 7 checkboxes editables con razon social de cada operadora\n- Texto aclaratorio 'Opcional: si deseas senalar tambien a tu compania...'\n- Campo adicional para indicar domicilio fiscal de la operadora seleccionada\n- Razones sociales verificadas: Radiomovil Dipsa, AT&T Comunicaciones Digitales, Pegaso PCS, Wal-Mart Innovacion, Altan Redes SAPI, Logistica ACN
</commit_message>
<xml_diff>
--- a/public/plantilla-amparo-panafe.docx
+++ b/public/plantilla-amparo-panafe.docx
@@ -279,10 +279,126 @@
           <w:color w:val="6B7280"/>
           <w:sz w:val="18"/>
         </w:rPr>
-        <w:t>Si deseas señalar también a tu compañía telefónica como autoridad responsable por la ejecución del acto, indícalo aquí:</w:t>
+        <w:t>Opcional: si deseas señalar también a tu compañía telefónica como autoridad responsable por la ejecución del acto, edita conforme a tu caso:</w:t>
       </w:r>
     </w:p>
     <w:p>
+      <w:pPr>
+        <w:spacing w:after="80"/>
+      </w:pPr>
+      <w:r>
+        <w:rPr>
+          <w:rFonts w:ascii="Calibri" w:hAnsi="Calibri" w:eastAsia="Calibri"/>
+          <w:b w:val="0"/>
+          <w:i w:val="0"/>
+          <w:sz w:val="22"/>
+        </w:rPr>
+        <w:t>☐ Telcel (Radiomóvil Dipsa, S.A. de C.V.)</w:t>
+      </w:r>
+    </w:p>
+    <w:p>
+      <w:pPr>
+        <w:spacing w:after="80"/>
+      </w:pPr>
+      <w:r>
+        <w:rPr>
+          <w:rFonts w:ascii="Calibri" w:hAnsi="Calibri" w:eastAsia="Calibri"/>
+          <w:b w:val="0"/>
+          <w:i w:val="0"/>
+          <w:sz w:val="22"/>
+        </w:rPr>
+        <w:t>☐ AT&amp;T (AT&amp;T Comunicaciones Digitales, S. de R.L. de C.V.)</w:t>
+      </w:r>
+    </w:p>
+    <w:p>
+      <w:pPr>
+        <w:spacing w:after="80"/>
+      </w:pPr>
+      <w:r>
+        <w:rPr>
+          <w:rFonts w:ascii="Calibri" w:hAnsi="Calibri" w:eastAsia="Calibri"/>
+          <w:b w:val="0"/>
+          <w:i w:val="0"/>
+          <w:sz w:val="22"/>
+        </w:rPr>
+        <w:t>☐ Movistar (Pegaso PCS, S.A. de C.V.)</w:t>
+      </w:r>
+    </w:p>
+    <w:p>
+      <w:pPr>
+        <w:spacing w:after="80"/>
+      </w:pPr>
+      <w:r>
+        <w:rPr>
+          <w:rFonts w:ascii="Calibri" w:hAnsi="Calibri" w:eastAsia="Calibri"/>
+          <w:b w:val="0"/>
+          <w:i w:val="0"/>
+          <w:sz w:val="22"/>
+        </w:rPr>
+        <w:t>☐ Bait (Wal-Mart Innovación, S. de R.L. de C.V.)</w:t>
+      </w:r>
+    </w:p>
+    <w:p>
+      <w:pPr>
+        <w:spacing w:after="80"/>
+      </w:pPr>
+      <w:r>
+        <w:rPr>
+          <w:rFonts w:ascii="Calibri" w:hAnsi="Calibri" w:eastAsia="Calibri"/>
+          <w:b w:val="0"/>
+          <w:i w:val="0"/>
+          <w:sz w:val="22"/>
+        </w:rPr>
+        <w:t>☐ Altán Redes (Altán Redes, S.A.P.I. de C.V.)</w:t>
+      </w:r>
+    </w:p>
+    <w:p>
+      <w:pPr>
+        <w:spacing w:after="80"/>
+      </w:pPr>
+      <w:r>
+        <w:rPr>
+          <w:rFonts w:ascii="Calibri" w:hAnsi="Calibri" w:eastAsia="Calibri"/>
+          <w:b w:val="0"/>
+          <w:i w:val="0"/>
+          <w:sz w:val="22"/>
+        </w:rPr>
+        <w:t>☐ Virgin Mobile</w:t>
+      </w:r>
+    </w:p>
+    <w:p>
+      <w:pPr>
+        <w:spacing w:after="80"/>
+      </w:pPr>
+      <w:r>
+        <w:rPr>
+          <w:rFonts w:ascii="Calibri" w:hAnsi="Calibri" w:eastAsia="Calibri"/>
+          <w:b w:val="0"/>
+          <w:i w:val="0"/>
+          <w:sz w:val="22"/>
+        </w:rPr>
+        <w:t>☐ Flash Mobile (Logística ACN México)</w:t>
+      </w:r>
+    </w:p>
+    <w:p>
+      <w:pPr>
+        <w:spacing w:after="120"/>
+      </w:pPr>
+      <w:r>
+        <w:rPr>
+          <w:rFonts w:ascii="Calibri" w:hAnsi="Calibri" w:eastAsia="Calibri"/>
+          <w:b w:val="0"/>
+          <w:i/>
+          <w:color w:val="6B7280"/>
+          <w:sz w:val="18"/>
+        </w:rPr>
+        <w:t>Si seleccionaste una o más compañías, indica su domicilio fiscal o el de atención al cliente que conoces:</w:t>
+      </w:r>
+    </w:p>
+    <w:p>
+      <w:pPr>
+        <w:spacing w:after="160"/>
+      </w:pPr>
       <w:r>
         <w:rPr>
           <w:rFonts w:ascii="Calibri" w:hAnsi="Calibri" w:eastAsia="Calibri"/>

</xml_diff>

<commit_message>
feat(plantilla-amparo): incluye direcciones fiscales junto a cada operadora\n\n- Cada checkbox ahora incluye razon social + direccion fiscal completa\n- Datos consistentes con el formulario de reporte de estafas (ScamAlert.tsx)\n- 7 opciones con direcciones precargadas, editables conforme al caso
</commit_message>
<xml_diff>
--- a/public/plantilla-amparo-panafe.docx
+++ b/public/plantilla-amparo-panafe.docx
@@ -293,7 +293,7 @@
           <w:i w:val="0"/>
           <w:sz w:val="22"/>
         </w:rPr>
-        <w:t>☐ Telcel (Radiomóvil Dipsa, S.A. de C.V.)</w:t>
+        <w:t>☐ Telcel (Radiomóvil Dipsa, S.A. de C.V.) — Calle Lago Zúrich número 245, Edificio Telcel, Colonia Ampliación Granada, Alcaldía Miguel Hidalgo, C.P. 11529, Ciudad de México, México</w:t>
       </w:r>
     </w:p>
     <w:p>
@@ -307,7 +307,7 @@
           <w:i w:val="0"/>
           <w:sz w:val="22"/>
         </w:rPr>
-        <w:t>☐ AT&amp;T (AT&amp;T Comunicaciones Digitales, S. de R.L. de C.V.)</w:t>
+        <w:t>☐ AT&amp;T (AT&amp;T Comunicaciones Digitales, S. de R.L. de C.V.) — Avenida Insurgentes Sur #1143, Colonia Nochebuena, Alcaldía Benito Juárez, C.P. 03720, Ciudad de México, México</w:t>
       </w:r>
     </w:p>
     <w:p>
@@ -321,7 +321,7 @@
           <w:i w:val="0"/>
           <w:sz w:val="22"/>
         </w:rPr>
-        <w:t>☐ Movistar (Pegaso PCS, S.A. de C.V.)</w:t>
+        <w:t>☐ Movistar (Pegaso PCS, S.A. de C.V.) — Prolongación Paseo de la Reforma No. 1200, Piso 14 y 18, Colonia Cruz Manca, Alcaldía Cuajimalpa de Morelos, C.P. 05349, Ciudad de México</w:t>
       </w:r>
     </w:p>
     <w:p>
@@ -335,7 +335,7 @@
           <w:i w:val="0"/>
           <w:sz w:val="22"/>
         </w:rPr>
-        <w:t>☐ Bait (Wal-Mart Innovación, S. de R.L. de C.V.)</w:t>
+        <w:t>☐ Bait (Wal-Mart Innovación, S. de R.L. de C.V.) — Nextengo 78, Santa Cruz Acayucan, Alcaldía Azcapotzalco, C.P. 02770, Ciudad de México, México</w:t>
       </w:r>
     </w:p>
     <w:p>
@@ -349,7 +349,7 @@
           <w:i w:val="0"/>
           <w:sz w:val="22"/>
         </w:rPr>
-        <w:t>☐ Altán Redes (Altán Redes, S.A.P.I. de C.V.)</w:t>
+        <w:t>☐ Altán Redes (Altán Redes, S.A.P.I. de C.V.) — Avenida Juan Salvador Agraz No. 101, Piso 2, Colonia Santa Fe Cuajimalpa, Alcaldía Cuajimalpa de Morelos, C.P. 05348, Ciudad de México, México</w:t>
       </w:r>
     </w:p>
     <w:p>
@@ -363,7 +363,7 @@
           <w:i w:val="0"/>
           <w:sz w:val="22"/>
         </w:rPr>
-        <w:t>☐ Virgin Mobile</w:t>
+        <w:t>☐ Virgin Mobile México — Calzada General Mariano Escobedo 526, Piso 10, Colonia Anzures, Alcaldía Miguel Hidalgo, C.P. 11590, Ciudad de México</w:t>
       </w:r>
     </w:p>
     <w:p>
@@ -377,7 +377,7 @@
           <w:i w:val="0"/>
           <w:sz w:val="22"/>
         </w:rPr>
-        <w:t>☐ Flash Mobile (Logística ACN México)</w:t>
+        <w:t>☐ Flash Mobile (Logística ACN México) — Avenida Insurgentes Sur número 1602, Piso 10, Oficina 1001, Colonia Crédito Constructor, Alcaldía Benito Juárez, C.P. 03940, Ciudad de México, México</w:t>
       </w:r>
     </w:p>
     <w:p>

</xml_diff>

<commit_message>
chore: usa nombre completo 'Constitucion Politica de los Estados Unidos Mexicanos' en toda la interfaz\n\n- Reemplaza uso aislado de 'Constitucion' por el nombre completo en AmparoSection.tsx\n- Actualiza plantilla DOCX con referencias completas a la Constitucion\n- Boton de descarga ahora muestra nombre completo del documento
</commit_message>
<xml_diff>
--- a/public/plantilla-amparo-panafe.docx
+++ b/public/plantilla-amparo-panafe.docx
@@ -603,7 +603,7 @@
           <w:color w:val="6B7280"/>
           <w:sz w:val="18"/>
         </w:rPr>
-        <w:t>Art. 108, fracc. V de la Ley de Amparo. Indica los artículos de la Constitución que consideras afectados.</w:t>
+        <w:t>Art. 108, fracc. V de la Ley de Amparo. Indica los artículos de la Constitución Política de los Estados Unidos Mexicanos que consideras afectados.</w:t>
       </w:r>
     </w:p>
     <w:p>
@@ -625,7 +625,7 @@
         <w:t>Referencias constitucionales aplicables (edita conforme a tu caso):</w:t>
         <w:br/>
         <w:br/>
-        <w:t>☐ Art. 1°: Derechos humanos reconocidos en la Constitución y en tratados internacionales. Principio de no discriminación.</w:t>
+        <w:t>☐ Art. 1°: Derechos humanos reconocidos en la Constitución Política de los Estados Unidos Mexicanos y en tratados internacionales. Principio de no discriminación.</w:t>
         <w:br/>
         <w:br/>
         <w:t>☐ Art. 6°: Derecho al libre acceso a tecnologías de información y comunicación, así como a servicios de telecomunicaciones e Internet.</w:t>

</xml_diff>